<commit_message>
added app description, synopsis, and updated user guide + minor fix
</commit_message>
<xml_diff>
--- a/docs/User_Guide.docx
+++ b/docs/User_Guide.docx
@@ -17,19 +17,11 @@
           <w:rFonts w:ascii="Times New Roman" w:hAnsi="Times New Roman" w:cs="Times New Roman"/>
         </w:rPr>
       </w:pPr>
-      <w:proofErr w:type="spellStart"/>
-      <w:r>
-        <w:rPr>
-          <w:rFonts w:ascii="Times New Roman" w:hAnsi="Times New Roman" w:cs="Times New Roman"/>
-        </w:rPr>
-        <w:t>CardioMonitor</w:t>
-      </w:r>
-      <w:proofErr w:type="spellEnd"/>
-      <w:r>
-        <w:rPr>
-          <w:rFonts w:ascii="Times New Roman" w:hAnsi="Times New Roman" w:cs="Times New Roman"/>
-        </w:rPr>
-        <w:t xml:space="preserve"> WebApp</w:t>
+      <w:r>
+        <w:rPr>
+          <w:rFonts w:ascii="Times New Roman" w:hAnsi="Times New Roman" w:cs="Times New Roman"/>
+        </w:rPr>
+        <w:t>CardioMonitor WebApp</w:t>
       </w:r>
     </w:p>
     <w:p>
@@ -425,13 +417,13 @@
         <mc:AlternateContent>
           <mc:Choice Requires="wps">
             <w:drawing>
-              <wp:anchor distT="0" distB="0" distL="114300" distR="114300" simplePos="0" relativeHeight="251663360" behindDoc="0" locked="0" layoutInCell="1" allowOverlap="1" wp14:anchorId="091ED95A" wp14:editId="54BE281D">
+              <wp:anchor distT="0" distB="0" distL="114300" distR="114300" simplePos="0" relativeHeight="251663360" behindDoc="0" locked="0" layoutInCell="1" allowOverlap="1" wp14:anchorId="091ED95A" wp14:editId="4BA5A012">
                 <wp:simplePos x="0" y="0"/>
-                <wp:positionH relativeFrom="column">
-                  <wp:posOffset>396240</wp:posOffset>
+                <wp:positionH relativeFrom="margin">
+                  <wp:align>center</wp:align>
                 </wp:positionH>
                 <wp:positionV relativeFrom="paragraph">
-                  <wp:posOffset>417830</wp:posOffset>
+                  <wp:posOffset>775970</wp:posOffset>
                 </wp:positionV>
                 <wp:extent cx="4869180" cy="274320"/>
                 <wp:effectExtent l="0" t="0" r="26670" b="11430"/>
@@ -500,7 +492,7 @@
                 <v:stroke joinstyle="miter"/>
                 <v:path gradientshapeok="t" o:connecttype="rect"/>
               </v:shapetype>
-              <v:shape id="Text Box 1" o:spid="_x0000_s1026" type="#_x0000_t202" style="position:absolute;left:0;text-align:left;margin-left:31.2pt;margin-top:32.9pt;width:383.4pt;height:21.6pt;z-index:251663360;visibility:visible;mso-wrap-style:square;mso-width-percent:0;mso-height-percent:0;mso-wrap-distance-left:9pt;mso-wrap-distance-top:0;mso-wrap-distance-right:9pt;mso-wrap-distance-bottom:0;mso-position-horizontal:absolute;mso-position-horizontal-relative:text;mso-position-vertical:absolute;mso-position-vertical-relative:text;mso-width-percent:0;mso-height-percent:0;mso-width-relative:margin;mso-height-relative:margin;v-text-anchor:top" o:gfxdata="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" fillcolor="white [3201]" strokeweight=".5pt">
+              <v:shape id="Text Box 1" o:spid="_x0000_s1026" type="#_x0000_t202" style="position:absolute;left:0;text-align:left;margin-left:0;margin-top:61.1pt;width:383.4pt;height:21.6pt;z-index:251663360;visibility:visible;mso-wrap-style:square;mso-width-percent:0;mso-height-percent:0;mso-wrap-distance-left:9pt;mso-wrap-distance-top:0;mso-wrap-distance-right:9pt;mso-wrap-distance-bottom:0;mso-position-horizontal:center;mso-position-horizontal-relative:margin;mso-position-vertical:absolute;mso-position-vertical-relative:text;mso-width-percent:0;mso-height-percent:0;mso-width-relative:margin;mso-height-relative:margin;v-text-anchor:top" o:gfxdata="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" fillcolor="white [3201]" strokeweight=".5pt">
                 <v:textbox>
                   <w:txbxContent>
                     <w:p>
@@ -518,6 +510,7 @@
                     </w:p>
                   </w:txbxContent>
                 </v:textbox>
+                <w10:wrap anchorx="margin"/>
               </v:shape>
             </w:pict>
           </mc:Fallback>
@@ -537,6 +530,33 @@
           <w:t>https://github.com/aimatochysia/cardio-monitor</w:t>
         </w:r>
       </w:hyperlink>
+      <w:r>
+        <w:t xml:space="preserve"> </w:t>
+      </w:r>
+      <w:r>
+        <w:t xml:space="preserve">by opening the link, then clikcing the green </w:t>
+      </w:r>
+      <w:r>
+        <w:t>“</w:t>
+      </w:r>
+      <w:r>
+        <w:t>Code</w:t>
+      </w:r>
+      <w:r>
+        <w:t>”</w:t>
+      </w:r>
+      <w:r>
+        <w:t xml:space="preserve"> button in the middle of the screenm then  click </w:t>
+      </w:r>
+      <w:r>
+        <w:t>“</w:t>
+      </w:r>
+      <w:r>
+        <w:t>Download ZIP</w:t>
+      </w:r>
+      <w:r>
+        <w:t>”</w:t>
+      </w:r>
       <w:r>
         <w:t xml:space="preserve"> </w:t>
       </w:r>
@@ -1202,7 +1222,218 @@
         <mc:AlternateContent>
           <mc:Choice Requires="wps">
             <w:drawing>
-              <wp:anchor distT="0" distB="0" distL="114300" distR="114300" simplePos="0" relativeHeight="251666432" behindDoc="0" locked="0" layoutInCell="1" allowOverlap="1" wp14:anchorId="1F8AF397" wp14:editId="1AA8FF2B">
+              <wp:anchor distT="0" distB="0" distL="114300" distR="114300" simplePos="0" relativeHeight="251677696" behindDoc="0" locked="0" layoutInCell="1" allowOverlap="1" wp14:anchorId="1D7FD098" wp14:editId="14D00E7B">
+                <wp:simplePos x="0" y="0"/>
+                <wp:positionH relativeFrom="column">
+                  <wp:posOffset>3150704</wp:posOffset>
+                </wp:positionH>
+                <wp:positionV relativeFrom="paragraph">
+                  <wp:posOffset>1668947</wp:posOffset>
+                </wp:positionV>
+                <wp:extent cx="281609" cy="90280"/>
+                <wp:effectExtent l="0" t="19050" r="42545" b="43180"/>
+                <wp:wrapNone/>
+                <wp:docPr id="193400063" name="Arrow: Right 3"/>
+                <wp:cNvGraphicFramePr/>
+                <a:graphic xmlns:a="http://schemas.openxmlformats.org/drawingml/2006/main">
+                  <a:graphicData uri="http://schemas.microsoft.com/office/word/2010/wordprocessingShape">
+                    <wps:wsp>
+                      <wps:cNvSpPr/>
+                      <wps:spPr>
+                        <a:xfrm>
+                          <a:off x="0" y="0"/>
+                          <a:ext cx="281609" cy="90280"/>
+                        </a:xfrm>
+                        <a:prstGeom prst="rightArrow">
+                          <a:avLst/>
+                        </a:prstGeom>
+                      </wps:spPr>
+                      <wps:style>
+                        <a:lnRef idx="2">
+                          <a:schemeClr val="dk1">
+                            <a:shade val="15000"/>
+                          </a:schemeClr>
+                        </a:lnRef>
+                        <a:fillRef idx="1">
+                          <a:schemeClr val="dk1"/>
+                        </a:fillRef>
+                        <a:effectRef idx="0">
+                          <a:schemeClr val="dk1"/>
+                        </a:effectRef>
+                        <a:fontRef idx="minor">
+                          <a:schemeClr val="lt1"/>
+                        </a:fontRef>
+                      </wps:style>
+                      <wps:bodyPr rot="0" spcFirstLastPara="0" vertOverflow="overflow" horzOverflow="overflow" vert="horz" wrap="square" lIns="91440" tIns="45720" rIns="91440" bIns="45720" numCol="1" spcCol="0" rtlCol="0" fromWordArt="0" anchor="ctr" anchorCtr="0" forceAA="0" compatLnSpc="1">
+                        <a:prstTxWarp prst="textNoShape">
+                          <a:avLst/>
+                        </a:prstTxWarp>
+                        <a:noAutofit/>
+                      </wps:bodyPr>
+                    </wps:wsp>
+                  </a:graphicData>
+                </a:graphic>
+                <wp14:sizeRelH relativeFrom="margin">
+                  <wp14:pctWidth>0</wp14:pctWidth>
+                </wp14:sizeRelH>
+                <wp14:sizeRelV relativeFrom="margin">
+                  <wp14:pctHeight>0</wp14:pctHeight>
+                </wp14:sizeRelV>
+              </wp:anchor>
+            </w:drawing>
+          </mc:Choice>
+          <mc:Fallback>
+            <w:pict>
+              <v:shapetype w14:anchorId="03F03507" id="_x0000_t13" coordsize="21600,21600" o:spt="13" adj="16200,5400" path="m@0,l@0@1,0@1,0@2@0@2@0,21600,21600,10800xe">
+                <v:stroke joinstyle="miter"/>
+                <v:formulas>
+                  <v:f eqn="val #0"/>
+                  <v:f eqn="val #1"/>
+                  <v:f eqn="sum height 0 #1"/>
+                  <v:f eqn="sum 10800 0 #1"/>
+                  <v:f eqn="sum width 0 #0"/>
+                  <v:f eqn="prod @4 @3 10800"/>
+                  <v:f eqn="sum width 0 @5"/>
+                </v:formulas>
+                <v:path o:connecttype="custom" o:connectlocs="@0,0;0,10800;@0,21600;21600,10800" o:connectangles="270,180,90,0" textboxrect="0,@1,@6,@2"/>
+                <v:handles>
+                  <v:h position="#0,#1" xrange="0,21600" yrange="0,10800"/>
+                </v:handles>
+              </v:shapetype>
+              <v:shape id="Arrow: Right 3" o:spid="_x0000_s1026" type="#_x0000_t13" style="position:absolute;margin-left:248.1pt;margin-top:131.4pt;width:22.15pt;height:7.1pt;z-index:251677696;visibility:visible;mso-wrap-style:square;mso-width-percent:0;mso-height-percent:0;mso-wrap-distance-left:9pt;mso-wrap-distance-top:0;mso-wrap-distance-right:9pt;mso-wrap-distance-bottom:0;mso-position-horizontal:absolute;mso-position-horizontal-relative:text;mso-position-vertical:absolute;mso-position-vertical-relative:text;mso-width-percent:0;mso-height-percent:0;mso-width-relative:margin;mso-height-relative:margin;v-text-anchor:middle" o:gfxdata="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" adj="18138" fillcolor="black [3200]" strokecolor="black [480]" strokeweight="1pt"/>
+            </w:pict>
+          </mc:Fallback>
+        </mc:AlternateContent>
+      </w:r>
+      <w:r>
+        <w:rPr>
+          <w:rFonts w:ascii="Times New Roman" w:hAnsi="Times New Roman" w:cs="Times New Roman"/>
+        </w:rPr>
+        <w:drawing>
+          <wp:anchor distT="0" distB="0" distL="114300" distR="114300" simplePos="0" relativeHeight="251665408" behindDoc="0" locked="0" layoutInCell="1" allowOverlap="1" wp14:anchorId="26FD2FEE" wp14:editId="2896EF6B">
+            <wp:simplePos x="0" y="0"/>
+            <wp:positionH relativeFrom="column">
+              <wp:posOffset>3437255</wp:posOffset>
+            </wp:positionH>
+            <wp:positionV relativeFrom="paragraph">
+              <wp:posOffset>269240</wp:posOffset>
+            </wp:positionV>
+            <wp:extent cx="2908935" cy="2915920"/>
+            <wp:effectExtent l="0" t="0" r="5715" b="0"/>
+            <wp:wrapTopAndBottom/>
+            <wp:docPr id="78828114" name="Picture 1"/>
+            <wp:cNvGraphicFramePr>
+              <a:graphicFrameLocks xmlns:a="http://schemas.openxmlformats.org/drawingml/2006/main" noChangeAspect="1"/>
+            </wp:cNvGraphicFramePr>
+            <a:graphic xmlns:a="http://schemas.openxmlformats.org/drawingml/2006/main">
+              <a:graphicData uri="http://schemas.openxmlformats.org/drawingml/2006/picture">
+                <pic:pic xmlns:pic="http://schemas.openxmlformats.org/drawingml/2006/picture">
+                  <pic:nvPicPr>
+                    <pic:cNvPr id="78828114" name=""/>
+                    <pic:cNvPicPr/>
+                  </pic:nvPicPr>
+                  <pic:blipFill>
+                    <a:blip r:embed="rId7" cstate="print">
+                      <a:extLst>
+                        <a:ext uri="{28A0092B-C50C-407E-A947-70E740481C1C}">
+                          <a14:useLocalDpi xmlns:a14="http://schemas.microsoft.com/office/drawing/2010/main" val="0"/>
+                        </a:ext>
+                      </a:extLst>
+                    </a:blip>
+                    <a:stretch>
+                      <a:fillRect/>
+                    </a:stretch>
+                  </pic:blipFill>
+                  <pic:spPr>
+                    <a:xfrm>
+                      <a:off x="0" y="0"/>
+                      <a:ext cx="2908935" cy="2915920"/>
+                    </a:xfrm>
+                    <a:prstGeom prst="rect">
+                      <a:avLst/>
+                    </a:prstGeom>
+                  </pic:spPr>
+                </pic:pic>
+              </a:graphicData>
+            </a:graphic>
+            <wp14:sizeRelH relativeFrom="margin">
+              <wp14:pctWidth>0</wp14:pctWidth>
+            </wp14:sizeRelH>
+            <wp14:sizeRelV relativeFrom="margin">
+              <wp14:pctHeight>0</wp14:pctHeight>
+            </wp14:sizeRelV>
+          </wp:anchor>
+        </w:drawing>
+      </w:r>
+      <w:r>
+        <w:rPr>
+          <w:rFonts w:ascii="Times New Roman" w:hAnsi="Times New Roman" w:cs="Times New Roman"/>
+        </w:rPr>
+        <w:drawing>
+          <wp:anchor distT="0" distB="0" distL="114300" distR="114300" simplePos="0" relativeHeight="251664384" behindDoc="0" locked="0" layoutInCell="1" allowOverlap="1" wp14:anchorId="18EF4638" wp14:editId="29FC1E82">
+            <wp:simplePos x="0" y="0"/>
+            <wp:positionH relativeFrom="column">
+              <wp:posOffset>248285</wp:posOffset>
+            </wp:positionH>
+            <wp:positionV relativeFrom="paragraph">
+              <wp:posOffset>274320</wp:posOffset>
+            </wp:positionV>
+            <wp:extent cx="2877185" cy="2910840"/>
+            <wp:effectExtent l="0" t="0" r="0" b="3810"/>
+            <wp:wrapTopAndBottom/>
+            <wp:docPr id="710981734" name="Picture 1"/>
+            <wp:cNvGraphicFramePr>
+              <a:graphicFrameLocks xmlns:a="http://schemas.openxmlformats.org/drawingml/2006/main" noChangeAspect="1"/>
+            </wp:cNvGraphicFramePr>
+            <a:graphic xmlns:a="http://schemas.openxmlformats.org/drawingml/2006/main">
+              <a:graphicData uri="http://schemas.openxmlformats.org/drawingml/2006/picture">
+                <pic:pic xmlns:pic="http://schemas.openxmlformats.org/drawingml/2006/picture">
+                  <pic:nvPicPr>
+                    <pic:cNvPr id="710981734" name=""/>
+                    <pic:cNvPicPr/>
+                  </pic:nvPicPr>
+                  <pic:blipFill>
+                    <a:blip r:embed="rId8" cstate="print">
+                      <a:extLst>
+                        <a:ext uri="{28A0092B-C50C-407E-A947-70E740481C1C}">
+                          <a14:useLocalDpi xmlns:a14="http://schemas.microsoft.com/office/drawing/2010/main" val="0"/>
+                        </a:ext>
+                      </a:extLst>
+                    </a:blip>
+                    <a:stretch>
+                      <a:fillRect/>
+                    </a:stretch>
+                  </pic:blipFill>
+                  <pic:spPr>
+                    <a:xfrm>
+                      <a:off x="0" y="0"/>
+                      <a:ext cx="2877185" cy="2910840"/>
+                    </a:xfrm>
+                    <a:prstGeom prst="rect">
+                      <a:avLst/>
+                    </a:prstGeom>
+                  </pic:spPr>
+                </pic:pic>
+              </a:graphicData>
+            </a:graphic>
+            <wp14:sizeRelH relativeFrom="page">
+              <wp14:pctWidth>0</wp14:pctWidth>
+            </wp14:sizeRelH>
+            <wp14:sizeRelV relativeFrom="page">
+              <wp14:pctHeight>0</wp14:pctHeight>
+            </wp14:sizeRelV>
+          </wp:anchor>
+        </w:drawing>
+      </w:r>
+      <w:r>
+        <w:rPr>
+          <w:rFonts w:ascii="Times New Roman" w:hAnsi="Times New Roman" w:cs="Times New Roman"/>
+          <w:noProof/>
+        </w:rPr>
+        <mc:AlternateContent>
+          <mc:Choice Requires="wps">
+            <w:drawing>
+              <wp:anchor distT="0" distB="0" distL="114300" distR="114300" simplePos="0" relativeHeight="251666432" behindDoc="0" locked="0" layoutInCell="1" allowOverlap="1" wp14:anchorId="1F8AF397" wp14:editId="2EFB7CA3">
                 <wp:simplePos x="0" y="0"/>
                 <wp:positionH relativeFrom="column">
                   <wp:posOffset>660400</wp:posOffset>
@@ -1262,130 +1493,10 @@
           </mc:Choice>
           <mc:Fallback>
             <w:pict>
-              <v:rect w14:anchorId="6E43DA37" id="Rectangle 2" o:spid="_x0000_s1026" style="position:absolute;margin-left:52pt;margin-top:34.8pt;width:20.4pt;height:13.6pt;z-index:251666432;visibility:visible;mso-wrap-style:square;mso-wrap-distance-left:9pt;mso-wrap-distance-top:0;mso-wrap-distance-right:9pt;mso-wrap-distance-bottom:0;mso-position-horizontal:absolute;mso-position-horizontal-relative:text;mso-position-vertical:absolute;mso-position-vertical-relative:text;v-text-anchor:middle" o:gfxdata="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" filled="f" strokecolor="#e00" strokeweight="1.5pt"/>
+              <v:rect w14:anchorId="2AA9E6E5" id="Rectangle 2" o:spid="_x0000_s1026" style="position:absolute;margin-left:52pt;margin-top:34.8pt;width:20.4pt;height:13.6pt;z-index:251666432;visibility:visible;mso-wrap-style:square;mso-wrap-distance-left:9pt;mso-wrap-distance-top:0;mso-wrap-distance-right:9pt;mso-wrap-distance-bottom:0;mso-position-horizontal:absolute;mso-position-horizontal-relative:text;mso-position-vertical:absolute;mso-position-vertical-relative:text;v-text-anchor:middle" o:gfxdata="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" filled="f" strokecolor="#e00" strokeweight="1.5pt"/>
             </w:pict>
           </mc:Fallback>
         </mc:AlternateContent>
-      </w:r>
-      <w:r>
-        <w:rPr>
-          <w:rFonts w:ascii="Times New Roman" w:hAnsi="Times New Roman" w:cs="Times New Roman"/>
-        </w:rPr>
-        <w:drawing>
-          <wp:anchor distT="0" distB="0" distL="114300" distR="114300" simplePos="0" relativeHeight="251665408" behindDoc="0" locked="0" layoutInCell="1" allowOverlap="1" wp14:anchorId="26FD2FEE" wp14:editId="701FB1EB">
-            <wp:simplePos x="0" y="0"/>
-            <wp:positionH relativeFrom="column">
-              <wp:posOffset>3370580</wp:posOffset>
-            </wp:positionH>
-            <wp:positionV relativeFrom="paragraph">
-              <wp:posOffset>269240</wp:posOffset>
-            </wp:positionV>
-            <wp:extent cx="2908935" cy="2915920"/>
-            <wp:effectExtent l="0" t="0" r="5715" b="0"/>
-            <wp:wrapTopAndBottom/>
-            <wp:docPr id="78828114" name="Picture 1"/>
-            <wp:cNvGraphicFramePr>
-              <a:graphicFrameLocks xmlns:a="http://schemas.openxmlformats.org/drawingml/2006/main" noChangeAspect="1"/>
-            </wp:cNvGraphicFramePr>
-            <a:graphic xmlns:a="http://schemas.openxmlformats.org/drawingml/2006/main">
-              <a:graphicData uri="http://schemas.openxmlformats.org/drawingml/2006/picture">
-                <pic:pic xmlns:pic="http://schemas.openxmlformats.org/drawingml/2006/picture">
-                  <pic:nvPicPr>
-                    <pic:cNvPr id="78828114" name=""/>
-                    <pic:cNvPicPr/>
-                  </pic:nvPicPr>
-                  <pic:blipFill>
-                    <a:blip r:embed="rId7" cstate="print">
-                      <a:extLst>
-                        <a:ext uri="{28A0092B-C50C-407E-A947-70E740481C1C}">
-                          <a14:useLocalDpi xmlns:a14="http://schemas.microsoft.com/office/drawing/2010/main" val="0"/>
-                        </a:ext>
-                      </a:extLst>
-                    </a:blip>
-                    <a:stretch>
-                      <a:fillRect/>
-                    </a:stretch>
-                  </pic:blipFill>
-                  <pic:spPr>
-                    <a:xfrm>
-                      <a:off x="0" y="0"/>
-                      <a:ext cx="2908935" cy="2915920"/>
-                    </a:xfrm>
-                    <a:prstGeom prst="rect">
-                      <a:avLst/>
-                    </a:prstGeom>
-                  </pic:spPr>
-                </pic:pic>
-              </a:graphicData>
-            </a:graphic>
-            <wp14:sizeRelH relativeFrom="margin">
-              <wp14:pctWidth>0</wp14:pctWidth>
-            </wp14:sizeRelH>
-            <wp14:sizeRelV relativeFrom="margin">
-              <wp14:pctHeight>0</wp14:pctHeight>
-            </wp14:sizeRelV>
-          </wp:anchor>
-        </w:drawing>
-      </w:r>
-      <w:r>
-        <w:rPr>
-          <w:rFonts w:ascii="Times New Roman" w:hAnsi="Times New Roman" w:cs="Times New Roman"/>
-        </w:rPr>
-        <w:drawing>
-          <wp:anchor distT="0" distB="0" distL="114300" distR="114300" simplePos="0" relativeHeight="251664384" behindDoc="0" locked="0" layoutInCell="1" allowOverlap="1" wp14:anchorId="18EF4638" wp14:editId="6ED157BC">
-            <wp:simplePos x="0" y="0"/>
-            <wp:positionH relativeFrom="column">
-              <wp:posOffset>-104140</wp:posOffset>
-            </wp:positionH>
-            <wp:positionV relativeFrom="paragraph">
-              <wp:posOffset>274320</wp:posOffset>
-            </wp:positionV>
-            <wp:extent cx="2877185" cy="2910840"/>
-            <wp:effectExtent l="0" t="0" r="0" b="3810"/>
-            <wp:wrapTopAndBottom/>
-            <wp:docPr id="710981734" name="Picture 1"/>
-            <wp:cNvGraphicFramePr>
-              <a:graphicFrameLocks xmlns:a="http://schemas.openxmlformats.org/drawingml/2006/main" noChangeAspect="1"/>
-            </wp:cNvGraphicFramePr>
-            <a:graphic xmlns:a="http://schemas.openxmlformats.org/drawingml/2006/main">
-              <a:graphicData uri="http://schemas.openxmlformats.org/drawingml/2006/picture">
-                <pic:pic xmlns:pic="http://schemas.openxmlformats.org/drawingml/2006/picture">
-                  <pic:nvPicPr>
-                    <pic:cNvPr id="710981734" name=""/>
-                    <pic:cNvPicPr/>
-                  </pic:nvPicPr>
-                  <pic:blipFill>
-                    <a:blip r:embed="rId8" cstate="print">
-                      <a:extLst>
-                        <a:ext uri="{28A0092B-C50C-407E-A947-70E740481C1C}">
-                          <a14:useLocalDpi xmlns:a14="http://schemas.microsoft.com/office/drawing/2010/main" val="0"/>
-                        </a:ext>
-                      </a:extLst>
-                    </a:blip>
-                    <a:stretch>
-                      <a:fillRect/>
-                    </a:stretch>
-                  </pic:blipFill>
-                  <pic:spPr>
-                    <a:xfrm>
-                      <a:off x="0" y="0"/>
-                      <a:ext cx="2877185" cy="2910840"/>
-                    </a:xfrm>
-                    <a:prstGeom prst="rect">
-                      <a:avLst/>
-                    </a:prstGeom>
-                  </pic:spPr>
-                </pic:pic>
-              </a:graphicData>
-            </a:graphic>
-            <wp14:sizeRelH relativeFrom="page">
-              <wp14:pctWidth>0</wp14:pctWidth>
-            </wp14:sizeRelH>
-            <wp14:sizeRelV relativeFrom="page">
-              <wp14:pctHeight>0</wp14:pctHeight>
-            </wp14:sizeRelV>
-          </wp:anchor>
-        </w:drawing>
       </w:r>
       <w:r>
         <w:rPr>
@@ -1648,7 +1759,7 @@
           </mc:Choice>
           <mc:Fallback>
             <w:pict>
-              <v:rect w14:anchorId="6F6AEC5B" id="Rectangle 2" o:spid="_x0000_s1026" style="position:absolute;margin-left:199.2pt;margin-top:111.2pt;width:44.8pt;height:84.4pt;z-index:251668480;visibility:visible;mso-wrap-style:square;mso-width-percent:0;mso-height-percent:0;mso-wrap-distance-left:9pt;mso-wrap-distance-top:0;mso-wrap-distance-right:9pt;mso-wrap-distance-bottom:0;mso-position-horizontal:absolute;mso-position-horizontal-relative:margin;mso-position-vertical:absolute;mso-position-vertical-relative:text;mso-width-percent:0;mso-height-percent:0;mso-width-relative:margin;mso-height-relative:margin;v-text-anchor:middle" o:gfxdata="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" filled="f" strokecolor="#e00" strokeweight="1.5pt">
+              <v:rect w14:anchorId="3714A5B5" id="Rectangle 2" o:spid="_x0000_s1026" style="position:absolute;margin-left:199.2pt;margin-top:111.2pt;width:44.8pt;height:84.4pt;z-index:251668480;visibility:visible;mso-wrap-style:square;mso-width-percent:0;mso-height-percent:0;mso-wrap-distance-left:9pt;mso-wrap-distance-top:0;mso-wrap-distance-right:9pt;mso-wrap-distance-bottom:0;mso-position-horizontal:absolute;mso-position-horizontal-relative:margin;mso-position-vertical:absolute;mso-position-vertical-relative:text;mso-width-percent:0;mso-height-percent:0;mso-width-relative:margin;mso-height-relative:margin;v-text-anchor:middle" o:gfxdata="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" filled="f" strokecolor="#e00" strokeweight="1.5pt">
                 <w10:wrap anchorx="margin"/>
               </v:rect>
             </w:pict>
@@ -1863,7 +1974,7 @@
           </mc:Choice>
           <mc:Fallback>
             <w:pict>
-              <v:rect w14:anchorId="0643C034" id="Rectangle 2" o:spid="_x0000_s1026" style="position:absolute;margin-left:264.4pt;margin-top:45.6pt;width:105.6pt;height:15.6pt;z-index:251676672;visibility:visible;mso-wrap-style:square;mso-width-percent:0;mso-height-percent:0;mso-wrap-distance-left:9pt;mso-wrap-distance-top:0;mso-wrap-distance-right:9pt;mso-wrap-distance-bottom:0;mso-position-horizontal:absolute;mso-position-horizontal-relative:margin;mso-position-vertical:absolute;mso-position-vertical-relative:text;mso-width-percent:0;mso-height-percent:0;mso-width-relative:margin;mso-height-relative:margin;v-text-anchor:middle" o:gfxdata="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" filled="f" strokecolor="#e00" strokeweight="1.5pt">
+              <v:rect w14:anchorId="06B3EE09" id="Rectangle 2" o:spid="_x0000_s1026" style="position:absolute;margin-left:264.4pt;margin-top:45.6pt;width:105.6pt;height:15.6pt;z-index:251676672;visibility:visible;mso-wrap-style:square;mso-width-percent:0;mso-height-percent:0;mso-wrap-distance-left:9pt;mso-wrap-distance-top:0;mso-wrap-distance-right:9pt;mso-wrap-distance-bottom:0;mso-position-horizontal:absolute;mso-position-horizontal-relative:margin;mso-position-vertical:absolute;mso-position-vertical-relative:text;mso-width-percent:0;mso-height-percent:0;mso-width-relative:margin;mso-height-relative:margin;v-text-anchor:middle" o:gfxdata="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" filled="f" strokecolor="#e00" strokeweight="1.5pt">
                 <w10:wrap anchorx="margin"/>
               </v:rect>
             </w:pict>
@@ -1960,6 +2071,87 @@
           <w:noProof/>
         </w:rPr>
         <w:lastRenderedPageBreak/>
+        <mc:AlternateContent>
+          <mc:Choice Requires="wps">
+            <w:drawing>
+              <wp:anchor distT="0" distB="0" distL="114300" distR="114300" simplePos="0" relativeHeight="251679744" behindDoc="0" locked="0" layoutInCell="1" allowOverlap="1" wp14:anchorId="57DCBA2E" wp14:editId="28234730">
+                <wp:simplePos x="0" y="0"/>
+                <wp:positionH relativeFrom="margin">
+                  <wp:posOffset>2007870</wp:posOffset>
+                </wp:positionH>
+                <wp:positionV relativeFrom="paragraph">
+                  <wp:posOffset>2853690</wp:posOffset>
+                </wp:positionV>
+                <wp:extent cx="1690255" cy="156210"/>
+                <wp:effectExtent l="0" t="0" r="24765" b="15240"/>
+                <wp:wrapNone/>
+                <wp:docPr id="936573287" name="Rectangle 2"/>
+                <wp:cNvGraphicFramePr/>
+                <a:graphic xmlns:a="http://schemas.openxmlformats.org/drawingml/2006/main">
+                  <a:graphicData uri="http://schemas.microsoft.com/office/word/2010/wordprocessingShape">
+                    <wps:wsp>
+                      <wps:cNvSpPr/>
+                      <wps:spPr>
+                        <a:xfrm>
+                          <a:off x="0" y="0"/>
+                          <a:ext cx="1690255" cy="156210"/>
+                        </a:xfrm>
+                        <a:prstGeom prst="rect">
+                          <a:avLst/>
+                        </a:prstGeom>
+                        <a:noFill/>
+                        <a:ln w="19050">
+                          <a:solidFill>
+                            <a:srgbClr val="EE0000"/>
+                          </a:solidFill>
+                        </a:ln>
+                      </wps:spPr>
+                      <wps:style>
+                        <a:lnRef idx="2">
+                          <a:schemeClr val="accent6"/>
+                        </a:lnRef>
+                        <a:fillRef idx="1">
+                          <a:schemeClr val="lt1"/>
+                        </a:fillRef>
+                        <a:effectRef idx="0">
+                          <a:schemeClr val="accent6"/>
+                        </a:effectRef>
+                        <a:fontRef idx="minor">
+                          <a:schemeClr val="dk1"/>
+                        </a:fontRef>
+                      </wps:style>
+                      <wps:bodyPr rot="0" spcFirstLastPara="0" vertOverflow="overflow" horzOverflow="overflow" vert="horz" wrap="square" lIns="91440" tIns="45720" rIns="91440" bIns="45720" numCol="1" spcCol="0" rtlCol="0" fromWordArt="0" anchor="ctr" anchorCtr="0" forceAA="0" compatLnSpc="1">
+                        <a:prstTxWarp prst="textNoShape">
+                          <a:avLst/>
+                        </a:prstTxWarp>
+                        <a:noAutofit/>
+                      </wps:bodyPr>
+                    </wps:wsp>
+                  </a:graphicData>
+                </a:graphic>
+                <wp14:sizeRelH relativeFrom="margin">
+                  <wp14:pctWidth>0</wp14:pctWidth>
+                </wp14:sizeRelH>
+                <wp14:sizeRelV relativeFrom="margin">
+                  <wp14:pctHeight>0</wp14:pctHeight>
+                </wp14:sizeRelV>
+              </wp:anchor>
+            </w:drawing>
+          </mc:Choice>
+          <mc:Fallback>
+            <w:pict>
+              <v:rect w14:anchorId="3CBF5E36" id="Rectangle 2" o:spid="_x0000_s1026" style="position:absolute;margin-left:158.1pt;margin-top:224.7pt;width:133.1pt;height:12.3pt;z-index:251679744;visibility:visible;mso-wrap-style:square;mso-width-percent:0;mso-height-percent:0;mso-wrap-distance-left:9pt;mso-wrap-distance-top:0;mso-wrap-distance-right:9pt;mso-wrap-distance-bottom:0;mso-position-horizontal:absolute;mso-position-horizontal-relative:margin;mso-position-vertical:absolute;mso-position-vertical-relative:text;mso-width-percent:0;mso-height-percent:0;mso-width-relative:margin;mso-height-relative:margin;v-text-anchor:middle" o:gfxdata="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" filled="f" strokecolor="#e00" strokeweight="1.5pt">
+                <w10:wrap anchorx="margin"/>
+              </v:rect>
+            </w:pict>
+          </mc:Fallback>
+        </mc:AlternateContent>
+      </w:r>
+      <w:r>
+        <w:rPr>
+          <w:rFonts w:ascii="Times New Roman" w:hAnsi="Times New Roman" w:cs="Times New Roman"/>
+          <w:noProof/>
+        </w:rPr>
         <mc:AlternateContent>
           <mc:Choice Requires="wps">
             <w:drawing>
@@ -2029,7 +2221,7 @@
           </mc:Choice>
           <mc:Fallback>
             <w:pict>
-              <v:rect w14:anchorId="0E521001" id="Rectangle 2" o:spid="_x0000_s1026" style="position:absolute;margin-left:40.8pt;margin-top:478pt;width:220.8pt;height:49.6pt;z-index:251674624;visibility:visible;mso-wrap-style:square;mso-width-percent:0;mso-height-percent:0;mso-wrap-distance-left:9pt;mso-wrap-distance-top:0;mso-wrap-distance-right:9pt;mso-wrap-distance-bottom:0;mso-position-horizontal:absolute;mso-position-horizontal-relative:margin;mso-position-vertical:absolute;mso-position-vertical-relative:text;mso-width-percent:0;mso-height-percent:0;mso-width-relative:margin;mso-height-relative:margin;v-text-anchor:middle" o:gfxdata="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" filled="f" strokecolor="#e00" strokeweight="1.5pt">
+              <v:rect w14:anchorId="34793DB8" id="Rectangle 2" o:spid="_x0000_s1026" style="position:absolute;margin-left:40.8pt;margin-top:478pt;width:220.8pt;height:49.6pt;z-index:251674624;visibility:visible;mso-wrap-style:square;mso-width-percent:0;mso-height-percent:0;mso-wrap-distance-left:9pt;mso-wrap-distance-top:0;mso-wrap-distance-right:9pt;mso-wrap-distance-bottom:0;mso-position-horizontal:absolute;mso-position-horizontal-relative:margin;mso-position-vertical:absolute;mso-position-vertical-relative:text;mso-width-percent:0;mso-height-percent:0;mso-width-relative:margin;mso-height-relative:margin;v-text-anchor:middle" o:gfxdata="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" filled="f" strokecolor="#e00" strokeweight="1.5pt">
                 <w10:wrap anchorx="margin"/>
               </v:rect>
             </w:pict>
@@ -2110,7 +2302,7 @@
           </mc:Choice>
           <mc:Fallback>
             <w:pict>
-              <v:rect w14:anchorId="1CBDFB95" id="Rectangle 2" o:spid="_x0000_s1026" style="position:absolute;margin-left:268pt;margin-top:389.2pt;width:195.6pt;height:27.6pt;z-index:251672576;visibility:visible;mso-wrap-style:square;mso-width-percent:0;mso-height-percent:0;mso-wrap-distance-left:9pt;mso-wrap-distance-top:0;mso-wrap-distance-right:9pt;mso-wrap-distance-bottom:0;mso-position-horizontal:absolute;mso-position-horizontal-relative:margin;mso-position-vertical:absolute;mso-position-vertical-relative:text;mso-width-percent:0;mso-height-percent:0;mso-width-relative:margin;mso-height-relative:margin;v-text-anchor:middle" o:gfxdata="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" filled="f" strokecolor="#e00" strokeweight="1.5pt">
+              <v:rect w14:anchorId="774021C5" id="Rectangle 2" o:spid="_x0000_s1026" style="position:absolute;margin-left:268pt;margin-top:389.2pt;width:195.6pt;height:27.6pt;z-index:251672576;visibility:visible;mso-wrap-style:square;mso-width-percent:0;mso-height-percent:0;mso-wrap-distance-left:9pt;mso-wrap-distance-top:0;mso-wrap-distance-right:9pt;mso-wrap-distance-bottom:0;mso-position-horizontal:absolute;mso-position-horizontal-relative:margin;mso-position-vertical:absolute;mso-position-vertical-relative:text;mso-width-percent:0;mso-height-percent:0;mso-width-relative:margin;mso-height-relative:margin;v-text-anchor:middle" o:gfxdata="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" filled="f" strokecolor="#e00" strokeweight="1.5pt">
                 <w10:wrap anchorx="margin"/>
               </v:rect>
             </w:pict>
@@ -2191,7 +2383,7 @@
           </mc:Choice>
           <mc:Fallback>
             <w:pict>
-              <v:rect w14:anchorId="21111905" id="Rectangle 2" o:spid="_x0000_s1026" style="position:absolute;margin-left:204.4pt;margin-top:122pt;width:44.8pt;height:84.4pt;z-index:251670528;visibility:visible;mso-wrap-style:square;mso-width-percent:0;mso-height-percent:0;mso-wrap-distance-left:9pt;mso-wrap-distance-top:0;mso-wrap-distance-right:9pt;mso-wrap-distance-bottom:0;mso-position-horizontal:absolute;mso-position-horizontal-relative:margin;mso-position-vertical:absolute;mso-position-vertical-relative:text;mso-width-percent:0;mso-height-percent:0;mso-width-relative:margin;mso-height-relative:margin;v-text-anchor:middle" o:gfxdata="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" filled="f" strokecolor="#e00" strokeweight="1.5pt">
+              <v:rect w14:anchorId="7F61FB5A" id="Rectangle 2" o:spid="_x0000_s1026" style="position:absolute;margin-left:204.4pt;margin-top:122pt;width:44.8pt;height:84.4pt;z-index:251670528;visibility:visible;mso-wrap-style:square;mso-width-percent:0;mso-height-percent:0;mso-wrap-distance-left:9pt;mso-wrap-distance-top:0;mso-wrap-distance-right:9pt;mso-wrap-distance-bottom:0;mso-position-horizontal:absolute;mso-position-horizontal-relative:margin;mso-position-vertical:absolute;mso-position-vertical-relative:text;mso-width-percent:0;mso-height-percent:0;mso-width-relative:margin;mso-height-relative:margin;v-text-anchor:middle" o:gfxdata="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" filled="f" strokecolor="#e00" strokeweight="1.5pt">
                 <w10:wrap anchorx="margin"/>
               </v:rect>
             </w:pict>
@@ -2329,6 +2521,224 @@
           <w:rFonts w:ascii="Times New Roman" w:hAnsi="Times New Roman" w:cs="Times New Roman"/>
         </w:rPr>
       </w:pPr>
+      <w:r>
+        <w:rPr>
+          <w:rFonts w:ascii="Times New Roman" w:hAnsi="Times New Roman" w:cs="Times New Roman"/>
+        </w:rPr>
+        <w:br w:type="page"/>
+      </w:r>
+    </w:p>
+    <w:p>
+      <w:pPr>
+        <w:pStyle w:val="ListParagraph"/>
+        <w:numPr>
+          <w:ilvl w:val="0"/>
+          <w:numId w:val="8"/>
+        </w:numPr>
+        <w:rPr>
+          <w:rFonts w:ascii="Times New Roman" w:hAnsi="Times New Roman" w:cs="Times New Roman"/>
+        </w:rPr>
+      </w:pPr>
+      <w:r>
+        <w:rPr>
+          <w:rFonts w:ascii="Times New Roman" w:hAnsi="Times New Roman" w:cs="Times New Roman"/>
+          <w:noProof/>
+        </w:rPr>
+        <w:lastRenderedPageBreak/>
+        <mc:AlternateContent>
+          <mc:Choice Requires="wps">
+            <w:drawing>
+              <wp:anchor distT="0" distB="0" distL="114300" distR="114300" simplePos="0" relativeHeight="251681792" behindDoc="0" locked="0" layoutInCell="1" allowOverlap="1" wp14:anchorId="77D24EB6" wp14:editId="250791C5">
+                <wp:simplePos x="0" y="0"/>
+                <wp:positionH relativeFrom="margin">
+                  <wp:posOffset>3720353</wp:posOffset>
+                </wp:positionH>
+                <wp:positionV relativeFrom="paragraph">
+                  <wp:posOffset>2734235</wp:posOffset>
+                </wp:positionV>
+                <wp:extent cx="717139" cy="190500"/>
+                <wp:effectExtent l="0" t="0" r="26035" b="19050"/>
+                <wp:wrapNone/>
+                <wp:docPr id="1842517406" name="Rectangle 2"/>
+                <wp:cNvGraphicFramePr/>
+                <a:graphic xmlns:a="http://schemas.openxmlformats.org/drawingml/2006/main">
+                  <a:graphicData uri="http://schemas.microsoft.com/office/word/2010/wordprocessingShape">
+                    <wps:wsp>
+                      <wps:cNvSpPr/>
+                      <wps:spPr>
+                        <a:xfrm>
+                          <a:off x="0" y="0"/>
+                          <a:ext cx="717139" cy="190500"/>
+                        </a:xfrm>
+                        <a:prstGeom prst="rect">
+                          <a:avLst/>
+                        </a:prstGeom>
+                        <a:noFill/>
+                        <a:ln w="19050">
+                          <a:solidFill>
+                            <a:srgbClr val="EE0000"/>
+                          </a:solidFill>
+                        </a:ln>
+                      </wps:spPr>
+                      <wps:style>
+                        <a:lnRef idx="2">
+                          <a:schemeClr val="accent6"/>
+                        </a:lnRef>
+                        <a:fillRef idx="1">
+                          <a:schemeClr val="lt1"/>
+                        </a:fillRef>
+                        <a:effectRef idx="0">
+                          <a:schemeClr val="accent6"/>
+                        </a:effectRef>
+                        <a:fontRef idx="minor">
+                          <a:schemeClr val="dk1"/>
+                        </a:fontRef>
+                      </wps:style>
+                      <wps:bodyPr rot="0" spcFirstLastPara="0" vertOverflow="overflow" horzOverflow="overflow" vert="horz" wrap="square" lIns="91440" tIns="45720" rIns="91440" bIns="45720" numCol="1" spcCol="0" rtlCol="0" fromWordArt="0" anchor="ctr" anchorCtr="0" forceAA="0" compatLnSpc="1">
+                        <a:prstTxWarp prst="textNoShape">
+                          <a:avLst/>
+                        </a:prstTxWarp>
+                        <a:noAutofit/>
+                      </wps:bodyPr>
+                    </wps:wsp>
+                  </a:graphicData>
+                </a:graphic>
+                <wp14:sizeRelH relativeFrom="margin">
+                  <wp14:pctWidth>0</wp14:pctWidth>
+                </wp14:sizeRelH>
+                <wp14:sizeRelV relativeFrom="margin">
+                  <wp14:pctHeight>0</wp14:pctHeight>
+                </wp14:sizeRelV>
+              </wp:anchor>
+            </w:drawing>
+          </mc:Choice>
+          <mc:Fallback>
+            <w:pict>
+              <v:rect w14:anchorId="1B788F8A" id="Rectangle 2" o:spid="_x0000_s1026" style="position:absolute;margin-left:292.95pt;margin-top:215.3pt;width:56.45pt;height:15pt;z-index:251681792;visibility:visible;mso-wrap-style:square;mso-width-percent:0;mso-height-percent:0;mso-wrap-distance-left:9pt;mso-wrap-distance-top:0;mso-wrap-distance-right:9pt;mso-wrap-distance-bottom:0;mso-position-horizontal:absolute;mso-position-horizontal-relative:margin;mso-position-vertical:absolute;mso-position-vertical-relative:text;mso-width-percent:0;mso-height-percent:0;mso-width-relative:margin;mso-height-relative:margin;v-text-anchor:middle" o:gfxdata="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" filled="f" strokecolor="#e00" strokeweight="1.5pt">
+                <w10:wrap anchorx="margin"/>
+              </v:rect>
+            </w:pict>
+          </mc:Fallback>
+        </mc:AlternateContent>
+      </w:r>
+      <w:r>
+        <w:rPr>
+          <w:rFonts w:ascii="Times New Roman" w:hAnsi="Times New Roman" w:cs="Times New Roman"/>
+        </w:rPr>
+        <w:t>Downloading Result as Compressed PNG Files</w:t>
+      </w:r>
+      <w:r>
+        <w:rPr>
+          <w:rFonts w:ascii="Times New Roman" w:hAnsi="Times New Roman" w:cs="Times New Roman"/>
+        </w:rPr>
+        <w:br/>
+      </w:r>
+      <w:r>
+        <w:rPr>
+          <w:rFonts w:ascii="Times New Roman" w:hAnsi="Times New Roman" w:cs="Times New Roman"/>
+        </w:rPr>
+        <w:drawing>
+          <wp:inline distT="0" distB="0" distL="0" distR="0" wp14:anchorId="116AD7FE" wp14:editId="464A9397">
+            <wp:extent cx="5731510" cy="7207885"/>
+            <wp:effectExtent l="0" t="0" r="2540" b="0"/>
+            <wp:docPr id="736314250" name="Picture 1"/>
+            <wp:cNvGraphicFramePr>
+              <a:graphicFrameLocks xmlns:a="http://schemas.openxmlformats.org/drawingml/2006/main" noChangeAspect="1"/>
+            </wp:cNvGraphicFramePr>
+            <a:graphic xmlns:a="http://schemas.openxmlformats.org/drawingml/2006/main">
+              <a:graphicData uri="http://schemas.openxmlformats.org/drawingml/2006/picture">
+                <pic:pic xmlns:pic="http://schemas.openxmlformats.org/drawingml/2006/picture">
+                  <pic:nvPicPr>
+                    <pic:cNvPr id="736314250" name=""/>
+                    <pic:cNvPicPr/>
+                  </pic:nvPicPr>
+                  <pic:blipFill>
+                    <a:blip r:embed="rId11"/>
+                    <a:stretch>
+                      <a:fillRect/>
+                    </a:stretch>
+                  </pic:blipFill>
+                  <pic:spPr>
+                    <a:xfrm>
+                      <a:off x="0" y="0"/>
+                      <a:ext cx="5731510" cy="7207885"/>
+                    </a:xfrm>
+                    <a:prstGeom prst="rect">
+                      <a:avLst/>
+                    </a:prstGeom>
+                  </pic:spPr>
+                </pic:pic>
+              </a:graphicData>
+            </a:graphic>
+          </wp:inline>
+        </w:drawing>
+      </w:r>
+      <w:r>
+        <w:rPr>
+          <w:rFonts w:ascii="Times New Roman" w:hAnsi="Times New Roman" w:cs="Times New Roman"/>
+        </w:rPr>
+        <w:br/>
+      </w:r>
+      <w:r>
+        <w:rPr>
+          <w:rFonts w:ascii="Times New Roman" w:hAnsi="Times New Roman" w:cs="Times New Roman"/>
+        </w:rPr>
+        <w:t xml:space="preserve">While the simulation is running or after it has finished, you can download the classification results by clicking the red square button. This will generate a ZIP file containing batches of PNG files named </w:t>
+      </w:r>
+      <w:r>
+        <w:rPr>
+          <w:rFonts w:ascii="Times New Roman" w:hAnsi="Times New Roman" w:cs="Times New Roman"/>
+        </w:rPr>
+        <w:t>“</w:t>
+      </w:r>
+      <w:r>
+        <w:rPr>
+          <w:rFonts w:ascii="Times New Roman" w:hAnsi="Times New Roman" w:cs="Times New Roman"/>
+        </w:rPr>
+        <w:t>ecg_batch_x_[datetime].png,</w:t>
+      </w:r>
+      <w:r>
+        <w:rPr>
+          <w:rFonts w:ascii="Times New Roman" w:hAnsi="Times New Roman" w:cs="Times New Roman"/>
+        </w:rPr>
+        <w:t>”</w:t>
+      </w:r>
+      <w:r>
+        <w:rPr>
+          <w:rFonts w:ascii="Times New Roman" w:hAnsi="Times New Roman" w:cs="Times New Roman"/>
+        </w:rPr>
+        <w:t xml:space="preserve"> where x indicates the batch number, increasing from 1 to the current point in time. You will then be prompted to choose a directory to save the ZIP file</w:t>
+      </w:r>
+      <w:r>
+        <w:rPr>
+          <w:rFonts w:ascii="Times New Roman" w:hAnsi="Times New Roman" w:cs="Times New Roman"/>
+        </w:rPr>
+        <w:t xml:space="preserve"> then </w:t>
+      </w:r>
+      <w:r>
+        <w:rPr>
+          <w:rFonts w:ascii="Times New Roman" w:hAnsi="Times New Roman" w:cs="Times New Roman"/>
+        </w:rPr>
+        <w:t>select a directory, preferably empty</w:t>
+      </w:r>
+      <w:r>
+        <w:rPr>
+          <w:rFonts w:ascii="Times New Roman" w:hAnsi="Times New Roman" w:cs="Times New Roman"/>
+        </w:rPr>
+        <w:t xml:space="preserve"> directory</w:t>
+      </w:r>
+      <w:r>
+        <w:rPr>
+          <w:rFonts w:ascii="Times New Roman" w:hAnsi="Times New Roman" w:cs="Times New Roman"/>
+        </w:rPr>
+        <w:t>. After unzipping, the PNG files can be further analyzed or archived. Note that exporting long monitoring sessions may take more time on older devices</w:t>
+      </w:r>
+      <w:r>
+        <w:rPr>
+          <w:rFonts w:ascii="Times New Roman" w:hAnsi="Times New Roman" w:cs="Times New Roman"/>
+        </w:rPr>
+        <w:t>.</w:t>
+      </w:r>
     </w:p>
     <w:sectPr>
       <w:pgSz w:w="11906" w:h="16838"/>

</xml_diff>